<commit_message>
Add edge function to serve OG metadata to social crawlers, fix duplicate canonical
</commit_message>
<xml_diff>
--- a/Blog 01 - Fundraising is Embarassing.docx
+++ b/Blog 01 - Fundraising is Embarassing.docx
@@ -9,9 +9,11 @@
       <w:r>
         <w:t xml:space="preserve">Fundraising is </w:t>
       </w:r>
-      <w:r>
-        <w:t>Begging</w:t>
-      </w:r>
+      <w:proofErr w:type="spellStart"/>
+      <w:r>
+        <w:t>Embarassing</w:t>
+      </w:r>
+      <w:proofErr w:type="spellEnd"/>
     </w:p>
     <w:p>
       <w:pPr>

</xml_diff>